<commit_message>
cnge the path to CD.xls
</commit_message>
<xml_diff>
--- a/ctg/ctgfuncts/CTG_RefFiles/template_Liste_CTG.docx
+++ b/ctg/ctgfuncts/CTG_RefFiles/template_Liste_CTG.docx
@@ -48,7 +48,7 @@
           <w:sz w:val="36"/>
           <w:szCs w:val="36"/>
         </w:rPr>
-        <w:t xml:space="preserve"> </w:t>
+        <w:t xml:space="preserve"> (N° fédéral : 0</w:t>
       </w:r>
       <w:r>
         <w:rPr>
@@ -57,7 +57,7 @@
           <w:sz w:val="36"/>
           <w:szCs w:val="36"/>
         </w:rPr>
-        <w:t>(</w:t>
+        <w:t>0</w:t>
       </w:r>
       <w:r>
         <w:rPr>
@@ -66,16 +66,32 @@
           <w:sz w:val="36"/>
           <w:szCs w:val="36"/>
         </w:rPr>
-        <w:t xml:space="preserve">N° fédéral : </w:t>
+        <w:t>212)</w:t>
+      </w:r>
+    </w:p>
+    <w:p>
+      <w:pPr>
+        <w:jc w:val="center"/>
+      </w:pPr>
+      <w:r>
+        <w:t xml:space="preserve">La liste émargée </w:t>
       </w:r>
       <w:r>
-        <w:rPr>
-          <w:b/>
-          <w:bCs/>
-          <w:sz w:val="36"/>
-          <w:szCs w:val="36"/>
-        </w:rPr>
-        <w:t>0212)</w:t>
+        <w:t>et votre RIB sont</w:t>
+      </w:r>
+      <w:r>
+        <w:t xml:space="preserve"> à envoyer à Annie Lapierre : </w:t>
+      </w:r>
+      <w:hyperlink r:id="rId6" w:history="1">
+        <w:r>
+          <w:rPr>
+            <w:rStyle w:val="Lienhypertexte"/>
+          </w:rPr>
+          <w:t>lapierreannie5@gmail.com</w:t>
+        </w:r>
+      </w:hyperlink>
+      <w:r>
+        <w:t xml:space="preserve"> </w:t>
       </w:r>
     </w:p>
     <w:tbl>
@@ -354,7 +370,6 @@
               <w:bottom w:val="single" w:sz="4" w:space="0" w:color="auto"/>
               <w:right w:val="single" w:sz="4" w:space="0" w:color="auto"/>
             </w:tcBorders>
-            <w:shd w:val="clear" w:color="auto" w:fill="auto"/>
             <w:noWrap/>
             <w:vAlign w:val="center"/>
           </w:tcPr>
@@ -415,7 +430,6 @@
               <w:bottom w:val="single" w:sz="4" w:space="0" w:color="auto"/>
               <w:right w:val="single" w:sz="4" w:space="0" w:color="auto"/>
             </w:tcBorders>
-            <w:shd w:val="clear" w:color="auto" w:fill="auto"/>
             <w:noWrap/>
             <w:vAlign w:val="center"/>
           </w:tcPr>
@@ -451,7 +465,6 @@
               <w:bottom w:val="single" w:sz="4" w:space="0" w:color="auto"/>
               <w:right w:val="single" w:sz="4" w:space="0" w:color="auto"/>
             </w:tcBorders>
-            <w:shd w:val="clear" w:color="auto" w:fill="auto"/>
             <w:noWrap/>
             <w:vAlign w:val="center"/>
           </w:tcPr>
@@ -477,7 +490,6 @@
               <w:t>{{</w:t>
             </w:r>
             <w:proofErr w:type="spellStart"/>
-            <w:proofErr w:type="gramStart"/>
             <w:r>
               <w:rPr>
                 <w:rFonts w:ascii="Calibri" w:eastAsia="Times New Roman" w:hAnsi="Calibri" w:cs="Calibri"/>
@@ -489,7 +501,6 @@
               <w:t>f.surname</w:t>
             </w:r>
             <w:proofErr w:type="spellEnd"/>
-            <w:proofErr w:type="gramEnd"/>
             <w:r>
               <w:rPr>
                 <w:rFonts w:ascii="Calibri" w:eastAsia="Times New Roman" w:hAnsi="Calibri" w:cs="Calibri"/>
@@ -511,7 +522,6 @@
               <w:bottom w:val="single" w:sz="4" w:space="0" w:color="auto"/>
               <w:right w:val="single" w:sz="4" w:space="0" w:color="auto"/>
             </w:tcBorders>
-            <w:shd w:val="clear" w:color="auto" w:fill="auto"/>
             <w:noWrap/>
             <w:vAlign w:val="center"/>
           </w:tcPr>
@@ -547,7 +557,6 @@
               <w:bottom w:val="single" w:sz="4" w:space="0" w:color="auto"/>
               <w:right w:val="single" w:sz="4" w:space="0" w:color="auto"/>
             </w:tcBorders>
-            <w:shd w:val="clear" w:color="auto" w:fill="auto"/>
             <w:noWrap/>
             <w:vAlign w:val="center"/>
           </w:tcPr>
@@ -605,7 +614,6 @@
               <w:bottom w:val="single" w:sz="4" w:space="0" w:color="auto"/>
               <w:right w:val="single" w:sz="4" w:space="0" w:color="auto"/>
             </w:tcBorders>
-            <w:shd w:val="clear" w:color="auto" w:fill="auto"/>
             <w:noWrap/>
             <w:vAlign w:val="center"/>
           </w:tcPr>
@@ -663,7 +671,6 @@
               <w:bottom w:val="single" w:sz="4" w:space="0" w:color="auto"/>
               <w:right w:val="single" w:sz="4" w:space="0" w:color="auto"/>
             </w:tcBorders>
-            <w:shd w:val="clear" w:color="auto" w:fill="auto"/>
             <w:noWrap/>
             <w:vAlign w:val="center"/>
           </w:tcPr>
@@ -695,7 +702,6 @@
               <w:bottom w:val="single" w:sz="4" w:space="0" w:color="auto"/>
               <w:right w:val="single" w:sz="4" w:space="0" w:color="auto"/>
             </w:tcBorders>
-            <w:shd w:val="clear" w:color="auto" w:fill="auto"/>
             <w:noWrap/>
             <w:vAlign w:val="center"/>
           </w:tcPr>
@@ -736,12 +742,12 @@
     </w:tbl>
     <w:p/>
     <w:sectPr>
-      <w:headerReference w:type="even" r:id="rId6"/>
-      <w:headerReference w:type="default" r:id="rId7"/>
-      <w:footerReference w:type="even" r:id="rId8"/>
-      <w:footerReference w:type="default" r:id="rId9"/>
-      <w:headerReference w:type="first" r:id="rId10"/>
-      <w:footerReference w:type="first" r:id="rId11"/>
+      <w:headerReference w:type="even" r:id="rId7"/>
+      <w:headerReference w:type="default" r:id="rId8"/>
+      <w:footerReference w:type="even" r:id="rId9"/>
+      <w:footerReference w:type="default" r:id="rId10"/>
+      <w:headerReference w:type="first" r:id="rId11"/>
+      <w:footerReference w:type="first" r:id="rId12"/>
       <w:pgSz w:w="11906" w:h="16838"/>
       <w:pgMar w:top="1417" w:right="1417" w:bottom="1417" w:left="1417" w:header="708" w:footer="708" w:gutter="0"/>
       <w:cols w:space="708"/>
@@ -1854,6 +1860,29 @@
     <w:uiPriority w:val="99"/>
     <w:rsid w:val="00F35F25"/>
   </w:style>
+  <w:style w:type="character" w:styleId="Lienhypertexte">
+    <w:name w:val="Hyperlink"/>
+    <w:basedOn w:val="Policepardfaut"/>
+    <w:uiPriority w:val="99"/>
+    <w:unhideWhenUsed/>
+    <w:rsid w:val="00A22992"/>
+    <w:rPr>
+      <w:color w:val="467886" w:themeColor="hyperlink"/>
+      <w:u w:val="single"/>
+    </w:rPr>
+  </w:style>
+  <w:style w:type="character" w:styleId="Mentionnonrsolue">
+    <w:name w:val="Unresolved Mention"/>
+    <w:basedOn w:val="Policepardfaut"/>
+    <w:uiPriority w:val="99"/>
+    <w:semiHidden/>
+    <w:unhideWhenUsed/>
+    <w:rsid w:val="00A22992"/>
+    <w:rPr>
+      <w:color w:val="605E5C"/>
+      <w:shd w:val="clear" w:color="auto" w:fill="E1DFDD"/>
+    </w:rPr>
+  </w:style>
 </w:styles>
 </file>
 

</xml_diff>